<commit_message>
Mise à jour du dossier de conception
</commit_message>
<xml_diff>
--- a/Dossier de conception.docx
+++ b/Dossier de conception.docx
@@ -56,7 +56,7 @@
         <w:pStyle w:val="Normal"/>
         <w:numPr>
           <w:ilvl w:val="0"/>
-          <w:numId w:val="6"/>
+          <w:numId w:val="5"/>
         </w:numPr>
         <w:bidi w:val="0"/>
         <w:jc w:val="both"/>
@@ -84,7 +84,7 @@
         <w:pStyle w:val="Normal"/>
         <w:numPr>
           <w:ilvl w:val="1"/>
-          <w:numId w:val="6"/>
+          <w:numId w:val="5"/>
         </w:numPr>
         <w:bidi w:val="0"/>
         <w:jc w:val="both"/>
@@ -111,7 +111,7 @@
           <w:numId w:val="0"/>
         </w:numPr>
         <w:bidi w:val="0"/>
-        <w:ind w:hanging="0" w:start="720"/>
+        <w:ind w:hanging="0" w:left="720"/>
         <w:jc w:val="both"/>
         <w:rPr>
           <w:lang w:val="fr-FR"/>
@@ -161,6 +161,148 @@
       <w:r>
         <w:rPr/>
         <w:t>Il faudra pouvoir charger un fichier Excel et extraire différentes informations comme :</w:t>
+      </w:r>
+    </w:p>
+    <w:p>
+      <w:pPr>
+        <w:pStyle w:val="BodyText"/>
+        <w:numPr>
+          <w:ilvl w:val="0"/>
+          <w:numId w:val="2"/>
+        </w:numPr>
+        <w:tabs>
+          <w:tab w:val="left" w:pos="709" w:leader="none"/>
+        </w:tabs>
+        <w:bidi w:val="0"/>
+        <w:spacing w:before="0" w:after="0"/>
+        <w:ind w:hanging="283" w:left="709"/>
+        <w:jc w:val="both"/>
+        <w:rPr/>
+      </w:pPr>
+      <w:r>
+        <w:rPr/>
+        <w:t xml:space="preserve">le nom </w:t>
+      </w:r>
+    </w:p>
+    <w:p>
+      <w:pPr>
+        <w:pStyle w:val="BodyText"/>
+        <w:numPr>
+          <w:ilvl w:val="0"/>
+          <w:numId w:val="2"/>
+        </w:numPr>
+        <w:tabs>
+          <w:tab w:val="left" w:pos="709" w:leader="none"/>
+        </w:tabs>
+        <w:bidi w:val="0"/>
+        <w:spacing w:before="0" w:after="0"/>
+        <w:ind w:hanging="283" w:left="709"/>
+        <w:jc w:val="both"/>
+        <w:rPr/>
+      </w:pPr>
+      <w:r>
+        <w:rPr/>
+        <w:t xml:space="preserve">le prénom </w:t>
+      </w:r>
+    </w:p>
+    <w:p>
+      <w:pPr>
+        <w:pStyle w:val="BodyText"/>
+        <w:numPr>
+          <w:ilvl w:val="0"/>
+          <w:numId w:val="2"/>
+        </w:numPr>
+        <w:tabs>
+          <w:tab w:val="left" w:pos="709" w:leader="none"/>
+        </w:tabs>
+        <w:bidi w:val="0"/>
+        <w:spacing w:before="0" w:after="0"/>
+        <w:ind w:hanging="283" w:left="709"/>
+        <w:jc w:val="both"/>
+        <w:rPr/>
+      </w:pPr>
+      <w:r>
+        <w:rPr/>
+        <w:t xml:space="preserve">le numéro étudiant </w:t>
+      </w:r>
+    </w:p>
+    <w:p>
+      <w:pPr>
+        <w:pStyle w:val="BodyText"/>
+        <w:numPr>
+          <w:ilvl w:val="0"/>
+          <w:numId w:val="2"/>
+        </w:numPr>
+        <w:tabs>
+          <w:tab w:val="left" w:pos="709" w:leader="none"/>
+        </w:tabs>
+        <w:bidi w:val="0"/>
+        <w:spacing w:before="0" w:after="0"/>
+        <w:ind w:hanging="283" w:left="709"/>
+        <w:jc w:val="both"/>
+        <w:rPr/>
+      </w:pPr>
+      <w:r>
+        <w:rPr/>
+        <w:t xml:space="preserve">le groupe </w:t>
+      </w:r>
+    </w:p>
+    <w:p>
+      <w:pPr>
+        <w:pStyle w:val="BodyText"/>
+        <w:numPr>
+          <w:ilvl w:val="0"/>
+          <w:numId w:val="2"/>
+        </w:numPr>
+        <w:tabs>
+          <w:tab w:val="left" w:pos="709" w:leader="none"/>
+        </w:tabs>
+        <w:bidi w:val="0"/>
+        <w:ind w:hanging="283" w:left="709"/>
+        <w:jc w:val="both"/>
+        <w:rPr/>
+      </w:pPr>
+      <w:r>
+        <w:rPr/>
+        <w:t xml:space="preserve">le sous-groupe </w:t>
+      </w:r>
+    </w:p>
+    <w:p>
+      <w:pPr>
+        <w:pStyle w:val="BodyText"/>
+        <w:bidi w:val="0"/>
+        <w:jc w:val="both"/>
+        <w:rPr/>
+      </w:pPr>
+      <w:r>
+        <w:rPr/>
+        <w:t>Si possible, il faut aussi pouvoir choisir les informations à importer.</w:t>
+      </w:r>
+    </w:p>
+    <w:p>
+      <w:pPr>
+        <w:pStyle w:val="BodyText"/>
+        <w:bidi w:val="0"/>
+        <w:jc w:val="both"/>
+        <w:rPr/>
+      </w:pPr>
+      <w:r>
+        <w:rPr/>
+        <w:t>L'idée est de créer un nouveau fichier Excel avec le numéro de la place attribuée à chaque étudiant.</w:t>
+        <w:br/>
+        <w:t>Si possible, il faudrait aussi générer le listing à afficher sur la porte.</w:t>
+      </w:r>
+    </w:p>
+    <w:p>
+      <w:pPr>
+        <w:pStyle w:val="BodyText"/>
+        <w:bidi w:val="0"/>
+        <w:jc w:val="both"/>
+        <w:rPr/>
+      </w:pPr>
+      <w:r>
+        <w:rPr/>
+        <w:t>Les fonctionnalités obligatoires sont :</w:t>
       </w:r>
     </w:p>
     <w:p>
@@ -171,18 +313,17 @@
           <w:numId w:val="3"/>
         </w:numPr>
         <w:tabs>
-          <w:tab w:val="clear" w:pos="709"/>
           <w:tab w:val="left" w:pos="709" w:leader="none"/>
         </w:tabs>
         <w:bidi w:val="0"/>
         <w:spacing w:before="0" w:after="0"/>
-        <w:ind w:hanging="283" w:start="709"/>
-        <w:jc w:val="both"/>
-        <w:rPr/>
-      </w:pPr>
-      <w:r>
-        <w:rPr/>
-        <w:t xml:space="preserve">le nom </w:t>
+        <w:ind w:hanging="283" w:left="709"/>
+        <w:jc w:val="both"/>
+        <w:rPr/>
+      </w:pPr>
+      <w:r>
+        <w:rPr/>
+        <w:t xml:space="preserve">Imposer des places pour certaines personnes (tel étudiant doit obligatoirement être associé à tel numéro) </w:t>
       </w:r>
     </w:p>
     <w:p>
@@ -193,18 +334,25 @@
           <w:numId w:val="3"/>
         </w:numPr>
         <w:tabs>
-          <w:tab w:val="clear" w:pos="709"/>
           <w:tab w:val="left" w:pos="709" w:leader="none"/>
         </w:tabs>
         <w:bidi w:val="0"/>
         <w:spacing w:before="0" w:after="0"/>
-        <w:ind w:hanging="283" w:start="709"/>
-        <w:jc w:val="both"/>
-        <w:rPr/>
-      </w:pPr>
-      <w:r>
-        <w:rPr/>
-        <w:t xml:space="preserve">le prénom </w:t>
+        <w:ind w:hanging="283" w:left="709"/>
+        <w:jc w:val="both"/>
+        <w:rPr/>
+      </w:pPr>
+      <w:r>
+        <w:rPr/>
+        <w:t xml:space="preserve">Pouvoir supprimer des places (et donc régénérer l'aléatoire </w:t>
+      </w:r>
+      <w:r>
+        <w:rPr/>
+        <w:t>si déjà généré</w:t>
+      </w:r>
+      <w:r>
+        <w:rPr/>
+        <w:t>)</w:t>
       </w:r>
     </w:p>
     <w:p>
@@ -215,99 +363,28 @@
           <w:numId w:val="3"/>
         </w:numPr>
         <w:tabs>
-          <w:tab w:val="clear" w:pos="709"/>
           <w:tab w:val="left" w:pos="709" w:leader="none"/>
         </w:tabs>
         <w:bidi w:val="0"/>
-        <w:spacing w:before="0" w:after="0"/>
-        <w:ind w:hanging="283" w:start="709"/>
-        <w:jc w:val="both"/>
-        <w:rPr/>
-      </w:pPr>
-      <w:r>
-        <w:rPr/>
-        <w:t xml:space="preserve">le numéro étudiant </w:t>
+        <w:ind w:hanging="283" w:left="709"/>
+        <w:jc w:val="both"/>
+        <w:rPr/>
+      </w:pPr>
+      <w:r>
+        <w:rPr/>
+        <w:t>Imposer un placement aléatoire tel que deux personnes d'un même groupe ne soient pas proches</w:t>
       </w:r>
     </w:p>
     <w:p>
       <w:pPr>
         <w:pStyle w:val="BodyText"/>
-        <w:numPr>
-          <w:ilvl w:val="0"/>
-          <w:numId w:val="3"/>
-        </w:numPr>
-        <w:tabs>
-          <w:tab w:val="clear" w:pos="709"/>
-          <w:tab w:val="left" w:pos="709" w:leader="none"/>
-        </w:tabs>
-        <w:bidi w:val="0"/>
-        <w:spacing w:before="0" w:after="0"/>
-        <w:ind w:hanging="283" w:start="709"/>
-        <w:jc w:val="both"/>
-        <w:rPr/>
-      </w:pPr>
-      <w:r>
-        <w:rPr/>
-        <w:t xml:space="preserve">le groupe </w:t>
-      </w:r>
-    </w:p>
-    <w:p>
-      <w:pPr>
-        <w:pStyle w:val="BodyText"/>
-        <w:numPr>
-          <w:ilvl w:val="0"/>
-          <w:numId w:val="3"/>
-        </w:numPr>
-        <w:tabs>
-          <w:tab w:val="clear" w:pos="709"/>
-          <w:tab w:val="left" w:pos="709" w:leader="none"/>
-        </w:tabs>
-        <w:bidi w:val="0"/>
-        <w:ind w:hanging="283" w:start="709"/>
-        <w:jc w:val="both"/>
-        <w:rPr/>
-      </w:pPr>
-      <w:r>
-        <w:rPr/>
-        <w:t xml:space="preserve">le sous-groupe </w:t>
-      </w:r>
-    </w:p>
-    <w:p>
-      <w:pPr>
-        <w:pStyle w:val="BodyText"/>
-        <w:bidi w:val="0"/>
-        <w:jc w:val="both"/>
-        <w:rPr/>
-      </w:pPr>
-      <w:r>
-        <w:rPr/>
-        <w:t>Si possible, il faut aussi pouvoir choisir les informations à importer.</w:t>
-      </w:r>
-    </w:p>
-    <w:p>
-      <w:pPr>
-        <w:pStyle w:val="BodyText"/>
-        <w:bidi w:val="0"/>
-        <w:jc w:val="both"/>
-        <w:rPr/>
-      </w:pPr>
-      <w:r>
-        <w:rPr/>
-        <w:t>L'idée est de créer un nouveau fichier Excel avec le numéro de la place attribuée à chaque étudiant.</w:t>
-        <w:br/>
-        <w:t>Si possible, il faudrait aussi générer le listing à afficher sur la porte.</w:t>
-      </w:r>
-    </w:p>
-    <w:p>
-      <w:pPr>
-        <w:pStyle w:val="BodyText"/>
-        <w:bidi w:val="0"/>
-        <w:jc w:val="both"/>
-        <w:rPr/>
-      </w:pPr>
-      <w:r>
-        <w:rPr/>
-        <w:t>Les fonctionnalités obligatoires sont :</w:t>
+        <w:bidi w:val="0"/>
+        <w:jc w:val="both"/>
+        <w:rPr/>
+      </w:pPr>
+      <w:r>
+        <w:rPr/>
+        <w:t>On peut aussi :</w:t>
       </w:r>
     </w:p>
     <w:p>
@@ -318,18 +395,17 @@
           <w:numId w:val="4"/>
         </w:numPr>
         <w:tabs>
-          <w:tab w:val="clear" w:pos="709"/>
           <w:tab w:val="left" w:pos="709" w:leader="none"/>
         </w:tabs>
         <w:bidi w:val="0"/>
         <w:spacing w:before="0" w:after="0"/>
-        <w:ind w:hanging="283" w:start="709"/>
-        <w:jc w:val="both"/>
-        <w:rPr/>
-      </w:pPr>
-      <w:r>
-        <w:rPr/>
-        <w:t xml:space="preserve">Imposer des places pour certaines personnes (tel étudiant doit obligatoirement être associé à tel numéro) </w:t>
+        <w:ind w:hanging="283" w:left="709"/>
+        <w:jc w:val="both"/>
+        <w:rPr/>
+      </w:pPr>
+      <w:r>
+        <w:rPr/>
+        <w:t>Imposer que des personnes ne soient pas à proximité (un étudiant ne doit pas être proche d'un autre, voire plus)</w:t>
       </w:r>
     </w:p>
     <w:p>
@@ -340,18 +416,17 @@
           <w:numId w:val="4"/>
         </w:numPr>
         <w:tabs>
-          <w:tab w:val="clear" w:pos="709"/>
           <w:tab w:val="left" w:pos="709" w:leader="none"/>
         </w:tabs>
         <w:bidi w:val="0"/>
         <w:spacing w:before="0" w:after="0"/>
-        <w:ind w:hanging="283" w:start="709"/>
-        <w:jc w:val="both"/>
-        <w:rPr/>
-      </w:pPr>
-      <w:r>
-        <w:rPr/>
-        <w:t xml:space="preserve">Pouvoir supprimer des places (et donc régénérer l'aléatoire) </w:t>
+        <w:ind w:hanging="283" w:left="709"/>
+        <w:jc w:val="both"/>
+        <w:rPr/>
+      </w:pPr>
+      <w:r>
+        <w:rPr/>
+        <w:t>Pouvoir modifier à la main le placement d'un étudiant</w:t>
       </w:r>
     </w:p>
     <w:p>
@@ -362,29 +437,17 @@
           <w:numId w:val="4"/>
         </w:numPr>
         <w:tabs>
-          <w:tab w:val="clear" w:pos="709"/>
           <w:tab w:val="left" w:pos="709" w:leader="none"/>
         </w:tabs>
         <w:bidi w:val="0"/>
-        <w:ind w:hanging="283" w:start="709"/>
-        <w:jc w:val="both"/>
-        <w:rPr/>
-      </w:pPr>
-      <w:r>
-        <w:rPr/>
-        <w:t xml:space="preserve">Imposer un placement aléatoire tel que deux personnes d'un même groupe ne soient pas proches </w:t>
-      </w:r>
-    </w:p>
-    <w:p>
-      <w:pPr>
-        <w:pStyle w:val="BodyText"/>
-        <w:bidi w:val="0"/>
-        <w:jc w:val="both"/>
-        <w:rPr/>
-      </w:pPr>
-      <w:r>
-        <w:rPr/>
-        <w:t>On peut aussi :</w:t>
+        <w:spacing w:before="0" w:after="0"/>
+        <w:ind w:hanging="283" w:left="709"/>
+        <w:jc w:val="both"/>
+        <w:rPr/>
+      </w:pPr>
+      <w:r>
+        <w:rPr/>
+        <w:t>Générer un plan avec le nom pour chaque place</w:t>
       </w:r>
     </w:p>
     <w:p>
@@ -392,86 +455,19 @@
         <w:pStyle w:val="BodyText"/>
         <w:numPr>
           <w:ilvl w:val="0"/>
-          <w:numId w:val="5"/>
+          <w:numId w:val="4"/>
         </w:numPr>
         <w:tabs>
-          <w:tab w:val="clear" w:pos="709"/>
           <w:tab w:val="left" w:pos="709" w:leader="none"/>
         </w:tabs>
         <w:bidi w:val="0"/>
-        <w:spacing w:before="0" w:after="0"/>
-        <w:ind w:hanging="283" w:start="709"/>
-        <w:jc w:val="both"/>
-        <w:rPr/>
-      </w:pPr>
-      <w:r>
-        <w:rPr/>
-        <w:t xml:space="preserve">Imposer que des personnes ne soient pas à proximité (un étudiant ne doit pas être proche d'un autre, voire plus) </w:t>
-      </w:r>
-    </w:p>
-    <w:p>
-      <w:pPr>
-        <w:pStyle w:val="BodyText"/>
-        <w:numPr>
-          <w:ilvl w:val="0"/>
-          <w:numId w:val="5"/>
-        </w:numPr>
-        <w:tabs>
-          <w:tab w:val="clear" w:pos="709"/>
-          <w:tab w:val="left" w:pos="709" w:leader="none"/>
-        </w:tabs>
-        <w:bidi w:val="0"/>
-        <w:spacing w:before="0" w:after="0"/>
-        <w:ind w:hanging="283" w:start="709"/>
-        <w:jc w:val="both"/>
-        <w:rPr/>
-      </w:pPr>
-      <w:r>
-        <w:rPr/>
-        <w:t xml:space="preserve">Pouvoir modifier à la main le placement d'un étudiant </w:t>
-      </w:r>
-    </w:p>
-    <w:p>
-      <w:pPr>
-        <w:pStyle w:val="BodyText"/>
-        <w:numPr>
-          <w:ilvl w:val="0"/>
-          <w:numId w:val="5"/>
-        </w:numPr>
-        <w:tabs>
-          <w:tab w:val="clear" w:pos="709"/>
-          <w:tab w:val="left" w:pos="709" w:leader="none"/>
-        </w:tabs>
-        <w:bidi w:val="0"/>
-        <w:spacing w:before="0" w:after="0"/>
-        <w:ind w:hanging="283" w:start="709"/>
-        <w:jc w:val="both"/>
-        <w:rPr/>
-      </w:pPr>
-      <w:r>
-        <w:rPr/>
-        <w:t xml:space="preserve">Générer un plan avec le nom pour chaque place </w:t>
-      </w:r>
-    </w:p>
-    <w:p>
-      <w:pPr>
-        <w:pStyle w:val="BodyText"/>
-        <w:numPr>
-          <w:ilvl w:val="0"/>
-          <w:numId w:val="5"/>
-        </w:numPr>
-        <w:tabs>
-          <w:tab w:val="clear" w:pos="709"/>
-          <w:tab w:val="left" w:pos="709" w:leader="none"/>
-        </w:tabs>
-        <w:bidi w:val="0"/>
-        <w:ind w:hanging="283" w:start="709"/>
-        <w:jc w:val="both"/>
-        <w:rPr/>
-      </w:pPr>
-      <w:r>
-        <w:rPr/>
-        <w:t xml:space="preserve">Pouvoir modifier la disposition des tables </w:t>
+        <w:ind w:hanging="283" w:left="709"/>
+        <w:jc w:val="both"/>
+        <w:rPr/>
+      </w:pPr>
+      <w:r>
+        <w:rPr/>
+        <w:t>Changer la taille de la salle (on part du principe que les salles sont toujours rectangulaires)</w:t>
       </w:r>
     </w:p>
     <w:p>
@@ -506,7 +502,7 @@
         <w:pStyle w:val="Normal"/>
         <w:numPr>
           <w:ilvl w:val="1"/>
-          <w:numId w:val="6"/>
+          <w:numId w:val="5"/>
         </w:numPr>
         <w:bidi w:val="0"/>
         <w:jc w:val="both"/>
@@ -577,7 +573,7 @@
         <w:pStyle w:val="Normal"/>
         <w:numPr>
           <w:ilvl w:val="0"/>
-          <w:numId w:val="6"/>
+          <w:numId w:val="5"/>
         </w:numPr>
         <w:bidi w:val="0"/>
         <w:jc w:val="both"/>
@@ -605,7 +601,7 @@
         <w:pStyle w:val="Normal"/>
         <w:numPr>
           <w:ilvl w:val="1"/>
-          <w:numId w:val="6"/>
+          <w:numId w:val="5"/>
         </w:numPr>
         <w:bidi w:val="0"/>
         <w:jc w:val="both"/>
@@ -644,13 +640,13 @@
         <w:pStyle w:val="NormalWeb"/>
         <w:bidi w:val="0"/>
         <w:spacing w:before="280" w:after="280"/>
-        <w:ind w:firstLine="243" w:start="465"/>
-        <w:jc w:val="start"/>
+        <w:ind w:firstLine="243" w:left="465"/>
+        <w:jc w:val="left"/>
         <w:rPr/>
       </w:pPr>
       <w:r>
         <w:drawing>
-          <wp:anchor behindDoc="0" distT="0" distB="0" distL="114300" distR="114300" simplePos="0" locked="0" layoutInCell="0" allowOverlap="1" relativeHeight="2">
+          <wp:anchor behindDoc="0" distT="0" distB="0" distL="114300" distR="114300" simplePos="0" locked="0" layoutInCell="0" allowOverlap="1" relativeHeight="3">
             <wp:simplePos x="0" y="0"/>
             <wp:positionH relativeFrom="margin">
               <wp:posOffset>4004945</wp:posOffset>
@@ -661,7 +657,7 @@
             <wp:extent cx="2333625" cy="2366645"/>
             <wp:effectExtent l="0" t="0" r="0" b="0"/>
             <wp:wrapSquare wrapText="bothSides"/>
-            <wp:docPr id="1" name="Image 1"/>
+            <wp:docPr id="1" name="Image 1" descr=""/>
             <wp:cNvGraphicFramePr>
               <a:graphicFrameLocks xmlns:a="http://schemas.openxmlformats.org/drawingml/2006/main" noChangeAspect="1"/>
             </wp:cNvGraphicFramePr>
@@ -669,7 +665,7 @@
               <a:graphicData uri="http://schemas.openxmlformats.org/drawingml/2006/picture">
                 <pic:pic xmlns:pic="http://schemas.openxmlformats.org/drawingml/2006/picture">
                   <pic:nvPicPr>
-                    <pic:cNvPr id="1" name="Image 1"/>
+                    <pic:cNvPr id="1" name="Image 1" descr=""/>
                     <pic:cNvPicPr>
                       <a:picLocks noChangeAspect="1" noChangeArrowheads="1"/>
                     </pic:cNvPicPr>
@@ -706,8 +702,8 @@
         <w:pStyle w:val="NormalWeb"/>
         <w:bidi w:val="0"/>
         <w:spacing w:before="280" w:after="280"/>
-        <w:ind w:start="825"/>
-        <w:jc w:val="start"/>
+        <w:ind w:left="825"/>
+        <w:jc w:val="left"/>
         <w:rPr/>
       </w:pPr>
       <w:r>
@@ -734,8 +730,8 @@
         <w:pStyle w:val="NormalWeb"/>
         <w:bidi w:val="0"/>
         <w:spacing w:before="280" w:after="280"/>
-        <w:ind w:start="825"/>
-        <w:jc w:val="start"/>
+        <w:ind w:left="825"/>
+        <w:jc w:val="left"/>
         <w:rPr/>
       </w:pPr>
       <w:r>
@@ -747,7 +743,7 @@
         <w:pStyle w:val="Normal"/>
         <w:numPr>
           <w:ilvl w:val="1"/>
-          <w:numId w:val="6"/>
+          <w:numId w:val="5"/>
         </w:numPr>
         <w:bidi w:val="0"/>
         <w:jc w:val="both"/>
@@ -802,11 +798,7 @@
       </w:pPr>
       <w:r>
         <w:rPr/>
-        <w:t>T</w:t>
-      </w:r>
-      <w:r>
-        <w:rPr/>
-        <w:t xml:space="preserve">outes seront applicables dans les deux modules de l'application dans l'un pour créer en les suivant </w:t>
+        <w:t xml:space="preserve">Toutes seront applicables dans les deux modules de l'application dans l'un pour créer en les suivant </w:t>
       </w:r>
     </w:p>
     <w:p>
@@ -841,43 +833,7 @@
       </w:pPr>
       <w:r>
         <w:rPr/>
-        <w:t>L’</w:t>
-      </w:r>
-      <w:r>
-        <w:rPr/>
-        <w:t xml:space="preserve">export du placement servira </w:t>
-      </w:r>
-      <w:r>
-        <w:rPr/>
-        <w:t xml:space="preserve">à </w:t>
-      </w:r>
-      <w:r>
-        <w:rPr/>
-        <w:t xml:space="preserve">fournir un tableau imprimable pour être affiché </w:t>
-      </w:r>
-      <w:r>
-        <w:rPr/>
-        <w:t>à</w:t>
-      </w:r>
-      <w:r>
-        <w:rPr/>
-        <w:t xml:space="preserve"> l'entrée de la salle de </w:t>
-      </w:r>
-      <w:r>
-        <w:rPr/>
-        <w:t>DS</w:t>
-      </w:r>
-      <w:r>
-        <w:rPr/>
-        <w:t xml:space="preserve"> et donner </w:t>
-      </w:r>
-      <w:r>
-        <w:rPr/>
-        <w:t>à</w:t>
-      </w:r>
-      <w:r>
-        <w:rPr/>
-        <w:t xml:space="preserve"> chaque étudiant son numéro de table.</w:t>
+        <w:t>L’export du placement servira à fournir un tableau imprimable pour être affiché à l'entrée de la salle de DS et donner à chaque étudiant son numéro de table.</w:t>
       </w:r>
     </w:p>
     <w:p>
@@ -902,103 +858,43 @@
         <w:rPr>
           <w:lang w:eastAsia="fr-FR"/>
         </w:rPr>
-        <w:t>Le</w:t>
-      </w:r>
-      <w:r>
+        <w:t>Le placement une fois terminé, le professeur doit pouvoir l'enregistrer s'il veut s'en resservir plus tard. Par exemple, il a 3 DS sur 2 semaines avec la même promo, le professeur veut alors alterner entre deux placements.</w:t>
+      </w:r>
+    </w:p>
+    <w:p>
+      <w:pPr>
+        <w:pStyle w:val="Normal"/>
+        <w:bidi w:val="0"/>
+        <w:jc w:val="both"/>
         <w:rPr>
           <w:lang w:eastAsia="fr-FR"/>
         </w:rPr>
-        <w:t xml:space="preserve"> placement une fois terminé, le professeur doit pouvoir l'enregistrer s'il veu</w:t>
-      </w:r>
+      </w:pPr>
       <w:r>
         <w:rPr>
           <w:lang w:eastAsia="fr-FR"/>
         </w:rPr>
-        <w:t>t</w:t>
-      </w:r>
+      </w:r>
+    </w:p>
+    <w:p>
+      <w:pPr>
+        <w:pStyle w:val="Normal"/>
+        <w:bidi w:val="0"/>
+        <w:jc w:val="both"/>
+        <w:rPr/>
+      </w:pPr>
       <w:r>
         <w:rPr>
           <w:lang w:eastAsia="fr-FR"/>
         </w:rPr>
-        <w:t xml:space="preserve"> s'en resservir plus tard. </w:t>
-      </w:r>
-      <w:r>
-        <w:rPr>
-          <w:lang w:eastAsia="fr-FR"/>
-        </w:rPr>
-        <w:t>P</w:t>
-      </w:r>
-      <w:r>
-        <w:rPr>
-          <w:lang w:eastAsia="fr-FR"/>
-        </w:rPr>
-        <w:t>ar exemple, il a 3 DS sur 2 semaines avec la même promo, le professeur veu</w:t>
-      </w:r>
-      <w:r>
-        <w:rPr>
-          <w:lang w:eastAsia="fr-FR"/>
-        </w:rPr>
-        <w:t>t</w:t>
-      </w:r>
-      <w:r>
-        <w:rPr>
-          <w:lang w:eastAsia="fr-FR"/>
-        </w:rPr>
-        <w:t xml:space="preserve"> alors  alterner entre deux placements.</w:t>
-      </w:r>
-    </w:p>
-    <w:p>
-      <w:pPr>
-        <w:pStyle w:val="Normal"/>
-        <w:bidi w:val="0"/>
-        <w:jc w:val="both"/>
-        <w:rPr>
-          <w:lang w:eastAsia="fr-FR"/>
-        </w:rPr>
-      </w:pPr>
-      <w:r>
-        <w:rPr>
-          <w:lang w:eastAsia="fr-FR"/>
-        </w:rPr>
-      </w:r>
-    </w:p>
-    <w:p>
-      <w:pPr>
-        <w:pStyle w:val="Normal"/>
-        <w:bidi w:val="0"/>
-        <w:jc w:val="both"/>
-        <w:rPr/>
-      </w:pPr>
-      <w:r>
-        <w:rPr>
-          <w:lang w:eastAsia="fr-FR"/>
-        </w:rPr>
-        <w:t>M</w:t>
-      </w:r>
-      <w:r>
-        <w:rPr>
-          <w:lang w:eastAsia="fr-FR"/>
-        </w:rPr>
-        <w:t>ais lors du troisième DS, il veu</w:t>
-      </w:r>
-      <w:r>
-        <w:rPr>
-          <w:lang w:eastAsia="fr-FR"/>
-        </w:rPr>
-        <w:t>t</w:t>
-      </w:r>
-      <w:r>
-        <w:rPr>
-          <w:lang w:eastAsia="fr-FR"/>
-        </w:rPr>
-        <w:t xml:space="preserve"> éloigner deux étudiants qu'il suspecte de triche. Il doit alors pouvoir ressortir son placement fait initialement pour lui appliquer des nouvelles modifications.</w:t>
+        <w:t>Mais lors du troisième DS, il veut éloigner deux étudiants qu'il suspecte de triche. Il doit alors pouvoir ressortir son placement fait initialement pour lui appliquer des nouvelles modifications.</w:t>
       </w:r>
     </w:p>
     <w:p>
       <w:pPr>
         <w:pStyle w:val="ListParagraph"/>
         <w:bidi w:val="0"/>
-        <w:jc w:val="start"/>
+        <w:jc w:val="left"/>
         <w:rPr>
           <w:rFonts w:ascii="Arial" w:hAnsi="Arial" w:cs="Arial"/>
           <w:sz w:val="28"/>
@@ -1018,7 +914,7 @@
         <w:pStyle w:val="Normal"/>
         <w:numPr>
           <w:ilvl w:val="1"/>
-          <w:numId w:val="6"/>
+          <w:numId w:val="5"/>
         </w:numPr>
         <w:bidi w:val="0"/>
         <w:jc w:val="both"/>
@@ -1057,7 +953,7 @@
         <w:pStyle w:val="Normal"/>
         <w:bidi w:val="0"/>
         <w:spacing w:lineRule="auto" w:line="240" w:beforeAutospacing="1" w:afterAutospacing="1"/>
-        <w:ind w:hanging="0" w:start="0"/>
+        <w:ind w:hanging="0" w:left="0"/>
         <w:jc w:val="both"/>
         <w:rPr>
           <w:rFonts w:ascii="Times New Roman" w:hAnsi="Times New Roman" w:eastAsia="Times New Roman" w:cs="Times New Roman"/>
@@ -1083,7 +979,7 @@
         <w:pStyle w:val="Normal"/>
         <w:bidi w:val="0"/>
         <w:spacing w:lineRule="auto" w:line="240" w:beforeAutospacing="1" w:afterAutospacing="1"/>
-        <w:ind w:hanging="0" w:start="0"/>
+        <w:ind w:hanging="0" w:left="0"/>
         <w:jc w:val="both"/>
         <w:rPr>
           <w:rFonts w:ascii="Times New Roman" w:hAnsi="Times New Roman" w:eastAsia="Times New Roman" w:cs="Times New Roman"/>
@@ -1107,7 +1003,7 @@
         <w:pStyle w:val="Normal"/>
         <w:bidi w:val="0"/>
         <w:spacing w:lineRule="auto" w:line="240" w:beforeAutospacing="1" w:afterAutospacing="1"/>
-        <w:ind w:hanging="0" w:start="0"/>
+        <w:ind w:hanging="0" w:left="0"/>
         <w:jc w:val="both"/>
         <w:rPr>
           <w:rFonts w:ascii="Times New Roman" w:hAnsi="Times New Roman" w:eastAsia="Times New Roman" w:cs="Times New Roman"/>
@@ -1133,7 +1029,7 @@
         <w:pStyle w:val="Normal"/>
         <w:bidi w:val="0"/>
         <w:spacing w:lineRule="auto" w:line="240" w:beforeAutospacing="1" w:afterAutospacing="1"/>
-        <w:ind w:hanging="0" w:start="0"/>
+        <w:ind w:hanging="0" w:left="0"/>
         <w:jc w:val="both"/>
         <w:rPr>
           <w:rFonts w:ascii="Times New Roman" w:hAnsi="Times New Roman" w:eastAsia="Times New Roman" w:cs="Times New Roman"/>
@@ -1157,7 +1053,7 @@
         <w:pStyle w:val="Normal"/>
         <w:numPr>
           <w:ilvl w:val="0"/>
-          <w:numId w:val="7"/>
+          <w:numId w:val="6"/>
         </w:numPr>
         <w:tabs>
           <w:tab w:val="clear" w:pos="709"/>
@@ -1188,7 +1084,7 @@
         <w:pStyle w:val="Normal"/>
         <w:numPr>
           <w:ilvl w:val="0"/>
-          <w:numId w:val="7"/>
+          <w:numId w:val="6"/>
         </w:numPr>
         <w:tabs>
           <w:tab w:val="clear" w:pos="709"/>
@@ -1219,7 +1115,7 @@
         <w:pStyle w:val="Normal"/>
         <w:numPr>
           <w:ilvl w:val="0"/>
-          <w:numId w:val="7"/>
+          <w:numId w:val="6"/>
         </w:numPr>
         <w:tabs>
           <w:tab w:val="clear" w:pos="709"/>
@@ -1250,7 +1146,7 @@
         <w:pStyle w:val="Normal"/>
         <w:numPr>
           <w:ilvl w:val="0"/>
-          <w:numId w:val="7"/>
+          <w:numId w:val="6"/>
         </w:numPr>
         <w:tabs>
           <w:tab w:val="clear" w:pos="709"/>
@@ -1281,7 +1177,7 @@
         <w:pStyle w:val="Normal"/>
         <w:numPr>
           <w:ilvl w:val="0"/>
-          <w:numId w:val="7"/>
+          <w:numId w:val="6"/>
         </w:numPr>
         <w:tabs>
           <w:tab w:val="clear" w:pos="709"/>
@@ -1312,8 +1208,8 @@
         <w:pStyle w:val="NormalWeb"/>
         <w:bidi w:val="0"/>
         <w:spacing w:before="280" w:after="280"/>
-        <w:ind w:hanging="0" w:start="0"/>
-        <w:jc w:val="start"/>
+        <w:ind w:hanging="0" w:left="0"/>
+        <w:jc w:val="left"/>
         <w:rPr/>
       </w:pPr>
       <w:r>
@@ -1325,7 +1221,7 @@
         <w:pStyle w:val="Normal"/>
         <w:numPr>
           <w:ilvl w:val="1"/>
-          <w:numId w:val="6"/>
+          <w:numId w:val="5"/>
         </w:numPr>
         <w:bidi w:val="0"/>
         <w:jc w:val="both"/>
@@ -1369,14 +1265,12 @@
         </w:rPr>
       </w:pPr>
       <w:r>
-        <w:rPr>
-          <w:lang w:val="fr-FR"/>
-        </w:rPr>
+        <w:rPr/>
         <w:drawing>
           <wp:inline distT="0" distB="0" distL="0" distR="0">
             <wp:extent cx="4417060" cy="2475230"/>
             <wp:effectExtent l="0" t="0" r="0" b="0"/>
-            <wp:docPr id="2" name="Image 2"/>
+            <wp:docPr id="2" name="Image 2" descr=""/>
             <wp:cNvGraphicFramePr>
               <a:graphicFrameLocks xmlns:a="http://schemas.openxmlformats.org/drawingml/2006/main" noChangeAspect="1"/>
             </wp:cNvGraphicFramePr>
@@ -1384,7 +1278,7 @@
               <a:graphicData uri="http://schemas.openxmlformats.org/drawingml/2006/picture">
                 <pic:pic xmlns:pic="http://schemas.openxmlformats.org/drawingml/2006/picture">
                   <pic:nvPicPr>
-                    <pic:cNvPr id="2" name="Image 2"/>
+                    <pic:cNvPr id="2" name="Image 2" descr=""/>
                     <pic:cNvPicPr>
                       <a:picLocks noChangeAspect="1" noChangeArrowheads="1"/>
                     </pic:cNvPicPr>
@@ -1434,6 +1328,7 @@
       <w:pgNumType w:fmt="decimal"/>
       <w:formProt w:val="false"/>
       <w:textDirection w:val="lrTb"/>
+      <w:docGrid w:type="default" w:linePitch="100" w:charSpace="0"/>
     </w:sectPr>
   </w:body>
 </w:document>
@@ -1444,241 +1339,266 @@
   <w:abstractNum w:abstractNumId="1">
     <w:lvl w:ilvl="0">
       <w:start w:val="1"/>
-      <w:pStyle w:val="Heading1"/>
       <w:numFmt w:val="none"/>
       <w:suff w:val="nothing"/>
       <w:lvlText w:val=""/>
-      <w:lvlJc w:val="start"/>
+      <w:lvlJc w:val="left"/>
       <w:pPr>
         <w:tabs>
           <w:tab w:val="num" w:pos="0"/>
         </w:tabs>
-        <w:ind w:start="0" w:hanging="0"/>
-      </w:pPr>
+        <w:ind w:left="0" w:hanging="0"/>
+      </w:pPr>
+      <w:rPr/>
     </w:lvl>
     <w:lvl w:ilvl="1">
       <w:start w:val="1"/>
-      <w:pStyle w:val="Heading2"/>
       <w:numFmt w:val="none"/>
       <w:suff w:val="nothing"/>
       <w:lvlText w:val=""/>
-      <w:lvlJc w:val="start"/>
+      <w:lvlJc w:val="left"/>
       <w:pPr>
         <w:tabs>
           <w:tab w:val="num" w:pos="0"/>
         </w:tabs>
-        <w:ind w:start="0" w:hanging="0"/>
-      </w:pPr>
+        <w:ind w:left="0" w:hanging="0"/>
+      </w:pPr>
+      <w:rPr/>
     </w:lvl>
     <w:lvl w:ilvl="2">
       <w:start w:val="1"/>
       <w:numFmt w:val="none"/>
       <w:suff w:val="nothing"/>
       <w:lvlText w:val=""/>
-      <w:lvlJc w:val="start"/>
+      <w:lvlJc w:val="left"/>
       <w:pPr>
         <w:tabs>
           <w:tab w:val="num" w:pos="0"/>
         </w:tabs>
-        <w:ind w:start="0" w:hanging="0"/>
-      </w:pPr>
+        <w:ind w:left="0" w:hanging="0"/>
+      </w:pPr>
+      <w:rPr/>
     </w:lvl>
     <w:lvl w:ilvl="3">
       <w:start w:val="1"/>
       <w:numFmt w:val="none"/>
       <w:suff w:val="nothing"/>
       <w:lvlText w:val=""/>
-      <w:lvlJc w:val="start"/>
+      <w:lvlJc w:val="left"/>
       <w:pPr>
         <w:tabs>
           <w:tab w:val="num" w:pos="0"/>
         </w:tabs>
-        <w:ind w:start="0" w:hanging="0"/>
-      </w:pPr>
+        <w:ind w:left="0" w:hanging="0"/>
+      </w:pPr>
+      <w:rPr/>
     </w:lvl>
     <w:lvl w:ilvl="4">
       <w:start w:val="1"/>
       <w:numFmt w:val="none"/>
       <w:suff w:val="nothing"/>
       <w:lvlText w:val=""/>
-      <w:lvlJc w:val="start"/>
+      <w:lvlJc w:val="left"/>
       <w:pPr>
         <w:tabs>
           <w:tab w:val="num" w:pos="0"/>
         </w:tabs>
-        <w:ind w:start="0" w:hanging="0"/>
-      </w:pPr>
+        <w:ind w:left="0" w:hanging="0"/>
+      </w:pPr>
+      <w:rPr/>
     </w:lvl>
     <w:lvl w:ilvl="5">
       <w:start w:val="1"/>
       <w:numFmt w:val="none"/>
       <w:suff w:val="nothing"/>
       <w:lvlText w:val=""/>
-      <w:lvlJc w:val="start"/>
+      <w:lvlJc w:val="left"/>
       <w:pPr>
         <w:tabs>
           <w:tab w:val="num" w:pos="0"/>
         </w:tabs>
-        <w:ind w:start="0" w:hanging="0"/>
-      </w:pPr>
+        <w:ind w:left="0" w:hanging="0"/>
+      </w:pPr>
+      <w:rPr/>
     </w:lvl>
     <w:lvl w:ilvl="6">
       <w:start w:val="1"/>
       <w:numFmt w:val="none"/>
       <w:suff w:val="nothing"/>
       <w:lvlText w:val=""/>
-      <w:lvlJc w:val="start"/>
+      <w:lvlJc w:val="left"/>
       <w:pPr>
         <w:tabs>
           <w:tab w:val="num" w:pos="0"/>
         </w:tabs>
-        <w:ind w:start="0" w:hanging="0"/>
-      </w:pPr>
+        <w:ind w:left="0" w:hanging="0"/>
+      </w:pPr>
+      <w:rPr/>
     </w:lvl>
     <w:lvl w:ilvl="7">
       <w:start w:val="1"/>
       <w:numFmt w:val="none"/>
       <w:suff w:val="nothing"/>
       <w:lvlText w:val=""/>
-      <w:lvlJc w:val="start"/>
+      <w:lvlJc w:val="left"/>
       <w:pPr>
         <w:tabs>
           <w:tab w:val="num" w:pos="0"/>
         </w:tabs>
-        <w:ind w:start="0" w:hanging="0"/>
-      </w:pPr>
+        <w:ind w:left="0" w:hanging="0"/>
+      </w:pPr>
+      <w:rPr/>
     </w:lvl>
     <w:lvl w:ilvl="8">
       <w:start w:val="1"/>
       <w:numFmt w:val="none"/>
       <w:suff w:val="nothing"/>
       <w:lvlText w:val=""/>
-      <w:lvlJc w:val="start"/>
+      <w:lvlJc w:val="left"/>
       <w:pPr>
         <w:tabs>
           <w:tab w:val="num" w:pos="0"/>
         </w:tabs>
-        <w:ind w:start="0" w:hanging="0"/>
-      </w:pPr>
+        <w:ind w:left="0" w:hanging="0"/>
+      </w:pPr>
+      <w:rPr/>
     </w:lvl>
   </w:abstractNum>
   <w:abstractNum w:abstractNumId="2">
     <w:lvl w:ilvl="0">
       <w:start w:val="1"/>
-      <w:numFmt w:val="upperLetter"/>
-      <w:lvlText w:val="%1)"/>
-      <w:lvlJc w:val="start"/>
-      <w:pPr>
-        <w:tabs>
-          <w:tab w:val="num" w:pos="720"/>
-        </w:tabs>
-        <w:ind w:start="720" w:hanging="360"/>
-      </w:pPr>
-      <w:rPr/>
+      <w:numFmt w:val="bullet"/>
+      <w:lvlText w:val=""/>
+      <w:lvlJc w:val="left"/>
+      <w:pPr>
+        <w:tabs>
+          <w:tab w:val="num" w:pos="709"/>
+        </w:tabs>
+        <w:ind w:left="709" w:hanging="283"/>
+      </w:pPr>
+      <w:rPr>
+        <w:rFonts w:ascii="Symbol" w:hAnsi="Symbol" w:cs="Symbol" w:hint="default"/>
+      </w:rPr>
     </w:lvl>
     <w:lvl w:ilvl="1">
       <w:start w:val="1"/>
-      <w:numFmt w:val="upperLetter"/>
-      <w:lvlText w:val="%2)"/>
-      <w:lvlJc w:val="start"/>
-      <w:pPr>
-        <w:tabs>
-          <w:tab w:val="num" w:pos="1080"/>
-        </w:tabs>
-        <w:ind w:start="1080" w:hanging="360"/>
-      </w:pPr>
-      <w:rPr/>
+      <w:numFmt w:val="bullet"/>
+      <w:lvlText w:val=""/>
+      <w:lvlJc w:val="left"/>
+      <w:pPr>
+        <w:tabs>
+          <w:tab w:val="num" w:pos="1418"/>
+        </w:tabs>
+        <w:ind w:left="1418" w:hanging="283"/>
+      </w:pPr>
+      <w:rPr>
+        <w:rFonts w:ascii="Symbol" w:hAnsi="Symbol" w:cs="Symbol" w:hint="default"/>
+      </w:rPr>
     </w:lvl>
     <w:lvl w:ilvl="2">
       <w:start w:val="1"/>
-      <w:numFmt w:val="upperLetter"/>
-      <w:lvlText w:val="%3)"/>
-      <w:lvlJc w:val="start"/>
-      <w:pPr>
-        <w:tabs>
-          <w:tab w:val="num" w:pos="1440"/>
-        </w:tabs>
-        <w:ind w:start="1440" w:hanging="360"/>
-      </w:pPr>
-      <w:rPr/>
+      <w:numFmt w:val="bullet"/>
+      <w:lvlText w:val=""/>
+      <w:lvlJc w:val="left"/>
+      <w:pPr>
+        <w:tabs>
+          <w:tab w:val="num" w:pos="2127"/>
+        </w:tabs>
+        <w:ind w:left="2127" w:hanging="283"/>
+      </w:pPr>
+      <w:rPr>
+        <w:rFonts w:ascii="Symbol" w:hAnsi="Symbol" w:cs="Symbol" w:hint="default"/>
+      </w:rPr>
     </w:lvl>
     <w:lvl w:ilvl="3">
       <w:start w:val="1"/>
-      <w:numFmt w:val="upperLetter"/>
-      <w:lvlText w:val="%4)"/>
-      <w:lvlJc w:val="start"/>
-      <w:pPr>
-        <w:tabs>
-          <w:tab w:val="num" w:pos="1800"/>
-        </w:tabs>
-        <w:ind w:start="1800" w:hanging="360"/>
-      </w:pPr>
-      <w:rPr/>
+      <w:numFmt w:val="bullet"/>
+      <w:lvlText w:val=""/>
+      <w:lvlJc w:val="left"/>
+      <w:pPr>
+        <w:tabs>
+          <w:tab w:val="num" w:pos="2836"/>
+        </w:tabs>
+        <w:ind w:left="2836" w:hanging="283"/>
+      </w:pPr>
+      <w:rPr>
+        <w:rFonts w:ascii="Symbol" w:hAnsi="Symbol" w:cs="Symbol" w:hint="default"/>
+      </w:rPr>
     </w:lvl>
     <w:lvl w:ilvl="4">
       <w:start w:val="1"/>
-      <w:numFmt w:val="upperLetter"/>
-      <w:lvlText w:val="%5)"/>
-      <w:lvlJc w:val="start"/>
-      <w:pPr>
-        <w:tabs>
-          <w:tab w:val="num" w:pos="2160"/>
-        </w:tabs>
-        <w:ind w:start="2160" w:hanging="360"/>
-      </w:pPr>
-      <w:rPr/>
+      <w:numFmt w:val="bullet"/>
+      <w:lvlText w:val=""/>
+      <w:lvlJc w:val="left"/>
+      <w:pPr>
+        <w:tabs>
+          <w:tab w:val="num" w:pos="3545"/>
+        </w:tabs>
+        <w:ind w:left="3545" w:hanging="283"/>
+      </w:pPr>
+      <w:rPr>
+        <w:rFonts w:ascii="Symbol" w:hAnsi="Symbol" w:cs="Symbol" w:hint="default"/>
+      </w:rPr>
     </w:lvl>
     <w:lvl w:ilvl="5">
       <w:start w:val="1"/>
-      <w:numFmt w:val="upperLetter"/>
-      <w:lvlText w:val="%6)"/>
-      <w:lvlJc w:val="start"/>
-      <w:pPr>
-        <w:tabs>
-          <w:tab w:val="num" w:pos="2520"/>
-        </w:tabs>
-        <w:ind w:start="2520" w:hanging="360"/>
-      </w:pPr>
-      <w:rPr/>
+      <w:numFmt w:val="bullet"/>
+      <w:lvlText w:val=""/>
+      <w:lvlJc w:val="left"/>
+      <w:pPr>
+        <w:tabs>
+          <w:tab w:val="num" w:pos="4254"/>
+        </w:tabs>
+        <w:ind w:left="4254" w:hanging="283"/>
+      </w:pPr>
+      <w:rPr>
+        <w:rFonts w:ascii="Symbol" w:hAnsi="Symbol" w:cs="Symbol" w:hint="default"/>
+      </w:rPr>
     </w:lvl>
     <w:lvl w:ilvl="6">
       <w:start w:val="1"/>
-      <w:numFmt w:val="upperLetter"/>
-      <w:lvlText w:val="%7)"/>
-      <w:lvlJc w:val="start"/>
-      <w:pPr>
-        <w:tabs>
-          <w:tab w:val="num" w:pos="2880"/>
-        </w:tabs>
-        <w:ind w:start="2880" w:hanging="360"/>
-      </w:pPr>
-      <w:rPr/>
+      <w:numFmt w:val="bullet"/>
+      <w:lvlText w:val=""/>
+      <w:lvlJc w:val="left"/>
+      <w:pPr>
+        <w:tabs>
+          <w:tab w:val="num" w:pos="4963"/>
+        </w:tabs>
+        <w:ind w:left="4963" w:hanging="283"/>
+      </w:pPr>
+      <w:rPr>
+        <w:rFonts w:ascii="Symbol" w:hAnsi="Symbol" w:cs="Symbol" w:hint="default"/>
+      </w:rPr>
     </w:lvl>
     <w:lvl w:ilvl="7">
       <w:start w:val="1"/>
-      <w:numFmt w:val="upperLetter"/>
-      <w:lvlText w:val="%8)"/>
-      <w:lvlJc w:val="start"/>
-      <w:pPr>
-        <w:tabs>
-          <w:tab w:val="num" w:pos="3240"/>
-        </w:tabs>
-        <w:ind w:start="3240" w:hanging="360"/>
-      </w:pPr>
-      <w:rPr/>
+      <w:numFmt w:val="bullet"/>
+      <w:lvlText w:val=""/>
+      <w:lvlJc w:val="left"/>
+      <w:pPr>
+        <w:tabs>
+          <w:tab w:val="num" w:pos="5672"/>
+        </w:tabs>
+        <w:ind w:left="5672" w:hanging="283"/>
+      </w:pPr>
+      <w:rPr>
+        <w:rFonts w:ascii="Symbol" w:hAnsi="Symbol" w:cs="Symbol" w:hint="default"/>
+      </w:rPr>
     </w:lvl>
     <w:lvl w:ilvl="8">
       <w:start w:val="1"/>
-      <w:numFmt w:val="upperLetter"/>
-      <w:lvlText w:val="%9)"/>
-      <w:lvlJc w:val="start"/>
-      <w:pPr>
-        <w:tabs>
-          <w:tab w:val="num" w:pos="3600"/>
-        </w:tabs>
-        <w:ind w:start="3600" w:hanging="360"/>
-      </w:pPr>
-      <w:rPr/>
+      <w:numFmt w:val="bullet"/>
+      <w:lvlText w:val=""/>
+      <w:lvlJc w:val="left"/>
+      <w:pPr>
+        <w:tabs>
+          <w:tab w:val="num" w:pos="6381"/>
+        </w:tabs>
+        <w:ind w:left="6381" w:hanging="283"/>
+      </w:pPr>
+      <w:rPr>
+        <w:rFonts w:ascii="Symbol" w:hAnsi="Symbol" w:cs="Symbol" w:hint="default"/>
+      </w:rPr>
     </w:lvl>
   </w:abstractNum>
   <w:abstractNum w:abstractNumId="3">
@@ -1686,12 +1606,12 @@
       <w:start w:val="1"/>
       <w:numFmt w:val="bullet"/>
       <w:lvlText w:val=""/>
-      <w:lvlJc w:val="start"/>
+      <w:lvlJc w:val="left"/>
       <w:pPr>
         <w:tabs>
           <w:tab w:val="num" w:pos="709"/>
         </w:tabs>
-        <w:ind w:start="709" w:hanging="283"/>
+        <w:ind w:left="709" w:hanging="283"/>
       </w:pPr>
       <w:rPr>
         <w:rFonts w:ascii="Symbol" w:hAnsi="Symbol" w:cs="Symbol" w:hint="default"/>
@@ -1701,12 +1621,12 @@
       <w:start w:val="1"/>
       <w:numFmt w:val="bullet"/>
       <w:lvlText w:val=""/>
-      <w:lvlJc w:val="start"/>
+      <w:lvlJc w:val="left"/>
       <w:pPr>
         <w:tabs>
           <w:tab w:val="num" w:pos="1418"/>
         </w:tabs>
-        <w:ind w:start="1418" w:hanging="283"/>
+        <w:ind w:left="1418" w:hanging="283"/>
       </w:pPr>
       <w:rPr>
         <w:rFonts w:ascii="Symbol" w:hAnsi="Symbol" w:cs="Symbol" w:hint="default"/>
@@ -1716,12 +1636,12 @@
       <w:start w:val="1"/>
       <w:numFmt w:val="bullet"/>
       <w:lvlText w:val=""/>
-      <w:lvlJc w:val="start"/>
+      <w:lvlJc w:val="left"/>
       <w:pPr>
         <w:tabs>
           <w:tab w:val="num" w:pos="2127"/>
         </w:tabs>
-        <w:ind w:start="2127" w:hanging="283"/>
+        <w:ind w:left="2127" w:hanging="283"/>
       </w:pPr>
       <w:rPr>
         <w:rFonts w:ascii="Symbol" w:hAnsi="Symbol" w:cs="Symbol" w:hint="default"/>
@@ -1731,12 +1651,12 @@
       <w:start w:val="1"/>
       <w:numFmt w:val="bullet"/>
       <w:lvlText w:val=""/>
-      <w:lvlJc w:val="start"/>
+      <w:lvlJc w:val="left"/>
       <w:pPr>
         <w:tabs>
           <w:tab w:val="num" w:pos="2836"/>
         </w:tabs>
-        <w:ind w:start="2836" w:hanging="283"/>
+        <w:ind w:left="2836" w:hanging="283"/>
       </w:pPr>
       <w:rPr>
         <w:rFonts w:ascii="Symbol" w:hAnsi="Symbol" w:cs="Symbol" w:hint="default"/>
@@ -1746,12 +1666,12 @@
       <w:start w:val="1"/>
       <w:numFmt w:val="bullet"/>
       <w:lvlText w:val=""/>
-      <w:lvlJc w:val="start"/>
+      <w:lvlJc w:val="left"/>
       <w:pPr>
         <w:tabs>
           <w:tab w:val="num" w:pos="3545"/>
         </w:tabs>
-        <w:ind w:start="3545" w:hanging="283"/>
+        <w:ind w:left="3545" w:hanging="283"/>
       </w:pPr>
       <w:rPr>
         <w:rFonts w:ascii="Symbol" w:hAnsi="Symbol" w:cs="Symbol" w:hint="default"/>
@@ -1761,12 +1681,12 @@
       <w:start w:val="1"/>
       <w:numFmt w:val="bullet"/>
       <w:lvlText w:val=""/>
-      <w:lvlJc w:val="start"/>
+      <w:lvlJc w:val="left"/>
       <w:pPr>
         <w:tabs>
           <w:tab w:val="num" w:pos="4254"/>
         </w:tabs>
-        <w:ind w:start="4254" w:hanging="283"/>
+        <w:ind w:left="4254" w:hanging="283"/>
       </w:pPr>
       <w:rPr>
         <w:rFonts w:ascii="Symbol" w:hAnsi="Symbol" w:cs="Symbol" w:hint="default"/>
@@ -1776,12 +1696,12 @@
       <w:start w:val="1"/>
       <w:numFmt w:val="bullet"/>
       <w:lvlText w:val=""/>
-      <w:lvlJc w:val="start"/>
+      <w:lvlJc w:val="left"/>
       <w:pPr>
         <w:tabs>
           <w:tab w:val="num" w:pos="4963"/>
         </w:tabs>
-        <w:ind w:start="4963" w:hanging="283"/>
+        <w:ind w:left="4963" w:hanging="283"/>
       </w:pPr>
       <w:rPr>
         <w:rFonts w:ascii="Symbol" w:hAnsi="Symbol" w:cs="Symbol" w:hint="default"/>
@@ -1791,12 +1711,12 @@
       <w:start w:val="1"/>
       <w:numFmt w:val="bullet"/>
       <w:lvlText w:val=""/>
-      <w:lvlJc w:val="start"/>
+      <w:lvlJc w:val="left"/>
       <w:pPr>
         <w:tabs>
           <w:tab w:val="num" w:pos="5672"/>
         </w:tabs>
-        <w:ind w:start="5672" w:hanging="283"/>
+        <w:ind w:left="5672" w:hanging="283"/>
       </w:pPr>
       <w:rPr>
         <w:rFonts w:ascii="Symbol" w:hAnsi="Symbol" w:cs="Symbol" w:hint="default"/>
@@ -1806,12 +1726,12 @@
       <w:start w:val="1"/>
       <w:numFmt w:val="bullet"/>
       <w:lvlText w:val=""/>
-      <w:lvlJc w:val="start"/>
+      <w:lvlJc w:val="left"/>
       <w:pPr>
         <w:tabs>
           <w:tab w:val="num" w:pos="6381"/>
         </w:tabs>
-        <w:ind w:start="6381" w:hanging="283"/>
+        <w:ind w:left="6381" w:hanging="283"/>
       </w:pPr>
       <w:rPr>
         <w:rFonts w:ascii="Symbol" w:hAnsi="Symbol" w:cs="Symbol" w:hint="default"/>
@@ -1823,12 +1743,12 @@
       <w:start w:val="1"/>
       <w:numFmt w:val="bullet"/>
       <w:lvlText w:val=""/>
-      <w:lvlJc w:val="start"/>
+      <w:lvlJc w:val="left"/>
       <w:pPr>
         <w:tabs>
           <w:tab w:val="num" w:pos="709"/>
         </w:tabs>
-        <w:ind w:start="709" w:hanging="283"/>
+        <w:ind w:left="709" w:hanging="283"/>
       </w:pPr>
       <w:rPr>
         <w:rFonts w:ascii="Symbol" w:hAnsi="Symbol" w:cs="Symbol" w:hint="default"/>
@@ -1838,12 +1758,12 @@
       <w:start w:val="1"/>
       <w:numFmt w:val="bullet"/>
       <w:lvlText w:val=""/>
-      <w:lvlJc w:val="start"/>
+      <w:lvlJc w:val="left"/>
       <w:pPr>
         <w:tabs>
           <w:tab w:val="num" w:pos="1418"/>
         </w:tabs>
-        <w:ind w:start="1418" w:hanging="283"/>
+        <w:ind w:left="1418" w:hanging="283"/>
       </w:pPr>
       <w:rPr>
         <w:rFonts w:ascii="Symbol" w:hAnsi="Symbol" w:cs="Symbol" w:hint="default"/>
@@ -1853,12 +1773,12 @@
       <w:start w:val="1"/>
       <w:numFmt w:val="bullet"/>
       <w:lvlText w:val=""/>
-      <w:lvlJc w:val="start"/>
+      <w:lvlJc w:val="left"/>
       <w:pPr>
         <w:tabs>
           <w:tab w:val="num" w:pos="2127"/>
         </w:tabs>
-        <w:ind w:start="2127" w:hanging="283"/>
+        <w:ind w:left="2127" w:hanging="283"/>
       </w:pPr>
       <w:rPr>
         <w:rFonts w:ascii="Symbol" w:hAnsi="Symbol" w:cs="Symbol" w:hint="default"/>
@@ -1868,12 +1788,12 @@
       <w:start w:val="1"/>
       <w:numFmt w:val="bullet"/>
       <w:lvlText w:val=""/>
-      <w:lvlJc w:val="start"/>
+      <w:lvlJc w:val="left"/>
       <w:pPr>
         <w:tabs>
           <w:tab w:val="num" w:pos="2836"/>
         </w:tabs>
-        <w:ind w:start="2836" w:hanging="283"/>
+        <w:ind w:left="2836" w:hanging="283"/>
       </w:pPr>
       <w:rPr>
         <w:rFonts w:ascii="Symbol" w:hAnsi="Symbol" w:cs="Symbol" w:hint="default"/>
@@ -1883,12 +1803,12 @@
       <w:start w:val="1"/>
       <w:numFmt w:val="bullet"/>
       <w:lvlText w:val=""/>
-      <w:lvlJc w:val="start"/>
+      <w:lvlJc w:val="left"/>
       <w:pPr>
         <w:tabs>
           <w:tab w:val="num" w:pos="3545"/>
         </w:tabs>
-        <w:ind w:start="3545" w:hanging="283"/>
+        <w:ind w:left="3545" w:hanging="283"/>
       </w:pPr>
       <w:rPr>
         <w:rFonts w:ascii="Symbol" w:hAnsi="Symbol" w:cs="Symbol" w:hint="default"/>
@@ -1898,12 +1818,12 @@
       <w:start w:val="1"/>
       <w:numFmt w:val="bullet"/>
       <w:lvlText w:val=""/>
-      <w:lvlJc w:val="start"/>
+      <w:lvlJc w:val="left"/>
       <w:pPr>
         <w:tabs>
           <w:tab w:val="num" w:pos="4254"/>
         </w:tabs>
-        <w:ind w:start="4254" w:hanging="283"/>
+        <w:ind w:left="4254" w:hanging="283"/>
       </w:pPr>
       <w:rPr>
         <w:rFonts w:ascii="Symbol" w:hAnsi="Symbol" w:cs="Symbol" w:hint="default"/>
@@ -1913,12 +1833,12 @@
       <w:start w:val="1"/>
       <w:numFmt w:val="bullet"/>
       <w:lvlText w:val=""/>
-      <w:lvlJc w:val="start"/>
+      <w:lvlJc w:val="left"/>
       <w:pPr>
         <w:tabs>
           <w:tab w:val="num" w:pos="4963"/>
         </w:tabs>
-        <w:ind w:start="4963" w:hanging="283"/>
+        <w:ind w:left="4963" w:hanging="283"/>
       </w:pPr>
       <w:rPr>
         <w:rFonts w:ascii="Symbol" w:hAnsi="Symbol" w:cs="Symbol" w:hint="default"/>
@@ -1928,12 +1848,12 @@
       <w:start w:val="1"/>
       <w:numFmt w:val="bullet"/>
       <w:lvlText w:val=""/>
-      <w:lvlJc w:val="start"/>
+      <w:lvlJc w:val="left"/>
       <w:pPr>
         <w:tabs>
           <w:tab w:val="num" w:pos="5672"/>
         </w:tabs>
-        <w:ind w:start="5672" w:hanging="283"/>
+        <w:ind w:left="5672" w:hanging="283"/>
       </w:pPr>
       <w:rPr>
         <w:rFonts w:ascii="Symbol" w:hAnsi="Symbol" w:cs="Symbol" w:hint="default"/>
@@ -1943,12 +1863,12 @@
       <w:start w:val="1"/>
       <w:numFmt w:val="bullet"/>
       <w:lvlText w:val=""/>
-      <w:lvlJc w:val="start"/>
+      <w:lvlJc w:val="left"/>
       <w:pPr>
         <w:tabs>
           <w:tab w:val="num" w:pos="6381"/>
         </w:tabs>
-        <w:ind w:start="6381" w:hanging="283"/>
+        <w:ind w:left="6381" w:hanging="283"/>
       </w:pPr>
       <w:rPr>
         <w:rFonts w:ascii="Symbol" w:hAnsi="Symbol" w:cs="Symbol" w:hint="default"/>
@@ -1958,395 +1878,377 @@
   <w:abstractNum w:abstractNumId="5">
     <w:lvl w:ilvl="0">
       <w:start w:val="1"/>
-      <w:numFmt w:val="bullet"/>
-      <w:lvlText w:val=""/>
-      <w:lvlJc w:val="start"/>
-      <w:pPr>
-        <w:tabs>
-          <w:tab w:val="num" w:pos="709"/>
-        </w:tabs>
-        <w:ind w:start="709" w:hanging="283"/>
-      </w:pPr>
-      <w:rPr>
-        <w:rFonts w:ascii="Symbol" w:hAnsi="Symbol" w:cs="Symbol" w:hint="default"/>
-      </w:rPr>
+      <w:numFmt w:val="none"/>
+      <w:suff w:val="nothing"/>
+      <w:lvlText w:val="%1"/>
+      <w:lvlJc w:val="left"/>
+      <w:pPr>
+        <w:tabs>
+          <w:tab w:val="num" w:pos="0"/>
+        </w:tabs>
+        <w:ind w:left="720" w:hanging="360"/>
+      </w:pPr>
+      <w:rPr/>
     </w:lvl>
     <w:lvl w:ilvl="1">
       <w:start w:val="1"/>
-      <w:numFmt w:val="bullet"/>
-      <w:lvlText w:val=""/>
-      <w:lvlJc w:val="start"/>
-      <w:pPr>
-        <w:tabs>
-          <w:tab w:val="num" w:pos="1418"/>
-        </w:tabs>
-        <w:ind w:start="1418" w:hanging="283"/>
-      </w:pPr>
-      <w:rPr>
-        <w:rFonts w:ascii="Symbol" w:hAnsi="Symbol" w:cs="Symbol" w:hint="default"/>
-      </w:rPr>
+      <w:numFmt w:val="lowerLetter"/>
+      <w:lvlText w:val="%1%2"/>
+      <w:lvlJc w:val="left"/>
+      <w:pPr>
+        <w:tabs>
+          <w:tab w:val="num" w:pos="1080"/>
+        </w:tabs>
+        <w:ind w:left="1080" w:hanging="360"/>
+      </w:pPr>
+      <w:rPr/>
     </w:lvl>
     <w:lvl w:ilvl="2">
       <w:start w:val="1"/>
-      <w:numFmt w:val="bullet"/>
-      <w:lvlText w:val=""/>
-      <w:lvlJc w:val="start"/>
-      <w:pPr>
-        <w:tabs>
-          <w:tab w:val="num" w:pos="2127"/>
-        </w:tabs>
-        <w:ind w:start="2127" w:hanging="283"/>
-      </w:pPr>
-      <w:rPr>
-        <w:rFonts w:ascii="Symbol" w:hAnsi="Symbol" w:cs="Symbol" w:hint="default"/>
-      </w:rPr>
+      <w:numFmt w:val="decimal"/>
+      <w:lvlText w:val="%1%2.%3"/>
+      <w:lvlJc w:val="left"/>
+      <w:pPr>
+        <w:tabs>
+          <w:tab w:val="num" w:pos="1440"/>
+        </w:tabs>
+        <w:ind w:left="1440" w:hanging="360"/>
+      </w:pPr>
+      <w:rPr/>
     </w:lvl>
     <w:lvl w:ilvl="3">
       <w:start w:val="1"/>
-      <w:numFmt w:val="bullet"/>
-      <w:lvlText w:val=""/>
-      <w:lvlJc w:val="start"/>
-      <w:pPr>
-        <w:tabs>
-          <w:tab w:val="num" w:pos="2836"/>
-        </w:tabs>
-        <w:ind w:start="2836" w:hanging="283"/>
-      </w:pPr>
-      <w:rPr>
-        <w:rFonts w:ascii="Symbol" w:hAnsi="Symbol" w:cs="Symbol" w:hint="default"/>
-      </w:rPr>
+      <w:numFmt w:val="decimal"/>
+      <w:lvlText w:val="%1%2.%3.%4"/>
+      <w:lvlJc w:val="left"/>
+      <w:pPr>
+        <w:tabs>
+          <w:tab w:val="num" w:pos="1800"/>
+        </w:tabs>
+        <w:ind w:left="1800" w:hanging="360"/>
+      </w:pPr>
+      <w:rPr/>
     </w:lvl>
     <w:lvl w:ilvl="4">
       <w:start w:val="1"/>
-      <w:numFmt w:val="bullet"/>
-      <w:lvlText w:val=""/>
-      <w:lvlJc w:val="start"/>
-      <w:pPr>
-        <w:tabs>
-          <w:tab w:val="num" w:pos="3545"/>
-        </w:tabs>
-        <w:ind w:start="3545" w:hanging="283"/>
-      </w:pPr>
-      <w:rPr>
-        <w:rFonts w:ascii="Symbol" w:hAnsi="Symbol" w:cs="Symbol" w:hint="default"/>
-      </w:rPr>
+      <w:numFmt w:val="decimal"/>
+      <w:lvlText w:val="%1%2.%3.%4.%5"/>
+      <w:lvlJc w:val="left"/>
+      <w:pPr>
+        <w:tabs>
+          <w:tab w:val="num" w:pos="2160"/>
+        </w:tabs>
+        <w:ind w:left="2160" w:hanging="360"/>
+      </w:pPr>
+      <w:rPr/>
     </w:lvl>
     <w:lvl w:ilvl="5">
       <w:start w:val="1"/>
-      <w:numFmt w:val="bullet"/>
-      <w:lvlText w:val=""/>
-      <w:lvlJc w:val="start"/>
-      <w:pPr>
-        <w:tabs>
-          <w:tab w:val="num" w:pos="4254"/>
-        </w:tabs>
-        <w:ind w:start="4254" w:hanging="283"/>
-      </w:pPr>
-      <w:rPr>
-        <w:rFonts w:ascii="Symbol" w:hAnsi="Symbol" w:cs="Symbol" w:hint="default"/>
-      </w:rPr>
+      <w:numFmt w:val="decimal"/>
+      <w:lvlText w:val="%1%2.%3.%4.%5.%6"/>
+      <w:lvlJc w:val="left"/>
+      <w:pPr>
+        <w:tabs>
+          <w:tab w:val="num" w:pos="2520"/>
+        </w:tabs>
+        <w:ind w:left="2520" w:hanging="360"/>
+      </w:pPr>
+      <w:rPr/>
     </w:lvl>
     <w:lvl w:ilvl="6">
       <w:start w:val="1"/>
-      <w:numFmt w:val="bullet"/>
-      <w:lvlText w:val=""/>
-      <w:lvlJc w:val="start"/>
-      <w:pPr>
-        <w:tabs>
-          <w:tab w:val="num" w:pos="4963"/>
-        </w:tabs>
-        <w:ind w:start="4963" w:hanging="283"/>
-      </w:pPr>
-      <w:rPr>
-        <w:rFonts w:ascii="Symbol" w:hAnsi="Symbol" w:cs="Symbol" w:hint="default"/>
-      </w:rPr>
+      <w:numFmt w:val="decimal"/>
+      <w:lvlText w:val="%1%2.%3.%4.%5.%6.%7"/>
+      <w:lvlJc w:val="left"/>
+      <w:pPr>
+        <w:tabs>
+          <w:tab w:val="num" w:pos="2880"/>
+        </w:tabs>
+        <w:ind w:left="2880" w:hanging="360"/>
+      </w:pPr>
+      <w:rPr/>
     </w:lvl>
     <w:lvl w:ilvl="7">
       <w:start w:val="1"/>
-      <w:numFmt w:val="bullet"/>
-      <w:lvlText w:val=""/>
-      <w:lvlJc w:val="start"/>
-      <w:pPr>
-        <w:tabs>
-          <w:tab w:val="num" w:pos="5672"/>
-        </w:tabs>
-        <w:ind w:start="5672" w:hanging="283"/>
-      </w:pPr>
-      <w:rPr>
-        <w:rFonts w:ascii="Symbol" w:hAnsi="Symbol" w:cs="Symbol" w:hint="default"/>
-      </w:rPr>
+      <w:numFmt w:val="decimal"/>
+      <w:lvlText w:val="%1%2.%3.%4.%5.%6.%7.%8"/>
+      <w:lvlJc w:val="left"/>
+      <w:pPr>
+        <w:tabs>
+          <w:tab w:val="num" w:pos="3240"/>
+        </w:tabs>
+        <w:ind w:left="3240" w:hanging="360"/>
+      </w:pPr>
+      <w:rPr/>
     </w:lvl>
     <w:lvl w:ilvl="8">
       <w:start w:val="1"/>
-      <w:numFmt w:val="bullet"/>
-      <w:lvlText w:val=""/>
-      <w:lvlJc w:val="start"/>
-      <w:pPr>
-        <w:tabs>
-          <w:tab w:val="num" w:pos="6381"/>
-        </w:tabs>
-        <w:ind w:start="6381" w:hanging="283"/>
-      </w:pPr>
-      <w:rPr>
-        <w:rFonts w:ascii="Symbol" w:hAnsi="Symbol" w:cs="Symbol" w:hint="default"/>
-      </w:rPr>
+      <w:numFmt w:val="decimal"/>
+      <w:lvlText w:val="%1%2.%3.%4.%5.%6.%7.%8.%9"/>
+      <w:lvlJc w:val="left"/>
+      <w:pPr>
+        <w:tabs>
+          <w:tab w:val="num" w:pos="3600"/>
+        </w:tabs>
+        <w:ind w:left="3600" w:hanging="360"/>
+      </w:pPr>
+      <w:rPr/>
     </w:lvl>
   </w:abstractNum>
   <w:abstractNum w:abstractNumId="6">
     <w:lvl w:ilvl="0">
       <w:start w:val="1"/>
-      <w:numFmt w:val="none"/>
-      <w:suff w:val="nothing"/>
-      <w:lvlText w:val="%1"/>
-      <w:lvlJc w:val="start"/>
+      <w:numFmt w:val="bullet"/>
+      <w:lvlText w:val=""/>
+      <w:lvlJc w:val="left"/>
       <w:pPr>
         <w:tabs>
           <w:tab w:val="num" w:pos="720"/>
         </w:tabs>
-        <w:ind w:start="720" w:hanging="360"/>
-      </w:pPr>
-      <w:rPr/>
+        <w:ind w:left="720" w:hanging="360"/>
+      </w:pPr>
+      <w:rPr>
+        <w:rFonts w:ascii="Symbol" w:hAnsi="Symbol" w:cs="Symbol" w:hint="default"/>
+      </w:rPr>
     </w:lvl>
     <w:lvl w:ilvl="1">
       <w:start w:val="1"/>
-      <w:numFmt w:val="lowerLetter"/>
-      <w:lvlText w:val="%1%2"/>
-      <w:lvlJc w:val="start"/>
+      <w:numFmt w:val="bullet"/>
+      <w:lvlText w:val="◦"/>
+      <w:lvlJc w:val="left"/>
       <w:pPr>
         <w:tabs>
           <w:tab w:val="num" w:pos="1080"/>
         </w:tabs>
-        <w:ind w:start="1080" w:hanging="360"/>
-      </w:pPr>
-      <w:rPr/>
+        <w:ind w:left="1080" w:hanging="360"/>
+      </w:pPr>
+      <w:rPr>
+        <w:rFonts w:ascii="OpenSymbol" w:hAnsi="OpenSymbol" w:cs="OpenSymbol" w:hint="default"/>
+      </w:rPr>
     </w:lvl>
     <w:lvl w:ilvl="2">
       <w:start w:val="1"/>
-      <w:numFmt w:val="decimal"/>
-      <w:lvlText w:val="%1%2.%3"/>
-      <w:lvlJc w:val="start"/>
+      <w:numFmt w:val="bullet"/>
+      <w:lvlText w:val="▪"/>
+      <w:lvlJc w:val="left"/>
       <w:pPr>
         <w:tabs>
           <w:tab w:val="num" w:pos="1440"/>
         </w:tabs>
-        <w:ind w:start="1440" w:hanging="360"/>
-      </w:pPr>
-      <w:rPr/>
+        <w:ind w:left="1440" w:hanging="360"/>
+      </w:pPr>
+      <w:rPr>
+        <w:rFonts w:ascii="OpenSymbol" w:hAnsi="OpenSymbol" w:cs="OpenSymbol" w:hint="default"/>
+      </w:rPr>
     </w:lvl>
     <w:lvl w:ilvl="3">
       <w:start w:val="1"/>
-      <w:numFmt w:val="decimal"/>
-      <w:lvlText w:val="%1%2.%3.%4"/>
-      <w:lvlJc w:val="start"/>
+      <w:numFmt w:val="bullet"/>
+      <w:lvlText w:val=""/>
+      <w:lvlJc w:val="left"/>
       <w:pPr>
         <w:tabs>
           <w:tab w:val="num" w:pos="1800"/>
         </w:tabs>
-        <w:ind w:start="1800" w:hanging="360"/>
-      </w:pPr>
-      <w:rPr/>
+        <w:ind w:left="1800" w:hanging="360"/>
+      </w:pPr>
+      <w:rPr>
+        <w:rFonts w:ascii="Symbol" w:hAnsi="Symbol" w:cs="Symbol" w:hint="default"/>
+      </w:rPr>
     </w:lvl>
     <w:lvl w:ilvl="4">
       <w:start w:val="1"/>
-      <w:numFmt w:val="decimal"/>
-      <w:lvlText w:val="%1%2.%3.%4.%5"/>
-      <w:lvlJc w:val="start"/>
+      <w:numFmt w:val="bullet"/>
+      <w:lvlText w:val="◦"/>
+      <w:lvlJc w:val="left"/>
       <w:pPr>
         <w:tabs>
           <w:tab w:val="num" w:pos="2160"/>
         </w:tabs>
-        <w:ind w:start="2160" w:hanging="360"/>
-      </w:pPr>
-      <w:rPr/>
+        <w:ind w:left="2160" w:hanging="360"/>
+      </w:pPr>
+      <w:rPr>
+        <w:rFonts w:ascii="OpenSymbol" w:hAnsi="OpenSymbol" w:cs="OpenSymbol" w:hint="default"/>
+      </w:rPr>
     </w:lvl>
     <w:lvl w:ilvl="5">
       <w:start w:val="1"/>
-      <w:numFmt w:val="decimal"/>
-      <w:lvlText w:val="%1%2.%3.%4.%5.%6"/>
-      <w:lvlJc w:val="start"/>
+      <w:numFmt w:val="bullet"/>
+      <w:lvlText w:val="▪"/>
+      <w:lvlJc w:val="left"/>
       <w:pPr>
         <w:tabs>
           <w:tab w:val="num" w:pos="2520"/>
         </w:tabs>
-        <w:ind w:start="2520" w:hanging="360"/>
-      </w:pPr>
-      <w:rPr/>
+        <w:ind w:left="2520" w:hanging="360"/>
+      </w:pPr>
+      <w:rPr>
+        <w:rFonts w:ascii="OpenSymbol" w:hAnsi="OpenSymbol" w:cs="OpenSymbol" w:hint="default"/>
+      </w:rPr>
     </w:lvl>
     <w:lvl w:ilvl="6">
       <w:start w:val="1"/>
-      <w:numFmt w:val="decimal"/>
-      <w:lvlText w:val="%1%2.%3.%4.%5.%6.%7"/>
-      <w:lvlJc w:val="start"/>
+      <w:numFmt w:val="bullet"/>
+      <w:lvlText w:val=""/>
+      <w:lvlJc w:val="left"/>
       <w:pPr>
         <w:tabs>
           <w:tab w:val="num" w:pos="2880"/>
         </w:tabs>
-        <w:ind w:start="2880" w:hanging="360"/>
-      </w:pPr>
-      <w:rPr/>
+        <w:ind w:left="2880" w:hanging="360"/>
+      </w:pPr>
+      <w:rPr>
+        <w:rFonts w:ascii="Symbol" w:hAnsi="Symbol" w:cs="Symbol" w:hint="default"/>
+      </w:rPr>
     </w:lvl>
     <w:lvl w:ilvl="7">
       <w:start w:val="1"/>
-      <w:numFmt w:val="decimal"/>
-      <w:lvlText w:val="%1%2.%3.%4.%5.%6.%7.%8"/>
-      <w:lvlJc w:val="start"/>
+      <w:numFmt w:val="bullet"/>
+      <w:lvlText w:val="◦"/>
+      <w:lvlJc w:val="left"/>
       <w:pPr>
         <w:tabs>
           <w:tab w:val="num" w:pos="3240"/>
         </w:tabs>
-        <w:ind w:start="3240" w:hanging="360"/>
-      </w:pPr>
-      <w:rPr/>
+        <w:ind w:left="3240" w:hanging="360"/>
+      </w:pPr>
+      <w:rPr>
+        <w:rFonts w:ascii="OpenSymbol" w:hAnsi="OpenSymbol" w:cs="OpenSymbol" w:hint="default"/>
+      </w:rPr>
     </w:lvl>
     <w:lvl w:ilvl="8">
       <w:start w:val="1"/>
-      <w:numFmt w:val="decimal"/>
-      <w:lvlText w:val="%1%2.%3.%4.%5.%6.%7.%8.%9"/>
-      <w:lvlJc w:val="start"/>
+      <w:numFmt w:val="bullet"/>
+      <w:lvlText w:val="▪"/>
+      <w:lvlJc w:val="left"/>
       <w:pPr>
         <w:tabs>
           <w:tab w:val="num" w:pos="3600"/>
         </w:tabs>
-        <w:ind w:start="3600" w:hanging="360"/>
-      </w:pPr>
-      <w:rPr/>
+        <w:ind w:left="3600" w:hanging="360"/>
+      </w:pPr>
+      <w:rPr>
+        <w:rFonts w:ascii="OpenSymbol" w:hAnsi="OpenSymbol" w:cs="OpenSymbol" w:hint="default"/>
+      </w:rPr>
     </w:lvl>
   </w:abstractNum>
   <w:abstractNum w:abstractNumId="7">
     <w:lvl w:ilvl="0">
       <w:start w:val="1"/>
-      <w:numFmt w:val="bullet"/>
-      <w:lvlText w:val=""/>
-      <w:lvlJc w:val="start"/>
-      <w:pPr>
-        <w:tabs>
-          <w:tab w:val="num" w:pos="720"/>
-        </w:tabs>
-        <w:ind w:start="720" w:hanging="360"/>
-      </w:pPr>
-      <w:rPr>
-        <w:rFonts w:ascii="Symbol" w:hAnsi="Symbol" w:cs="Symbol" w:hint="default"/>
-      </w:rPr>
+      <w:numFmt w:val="none"/>
+      <w:suff w:val="nothing"/>
+      <w:lvlText w:val=""/>
+      <w:lvlJc w:val="left"/>
+      <w:pPr>
+        <w:tabs>
+          <w:tab w:val="num" w:pos="0"/>
+        </w:tabs>
+        <w:ind w:left="0" w:hanging="0"/>
+      </w:pPr>
     </w:lvl>
     <w:lvl w:ilvl="1">
       <w:start w:val="1"/>
-      <w:numFmt w:val="bullet"/>
-      <w:lvlText w:val="◦"/>
-      <w:lvlJc w:val="start"/>
-      <w:pPr>
-        <w:tabs>
-          <w:tab w:val="num" w:pos="1080"/>
-        </w:tabs>
-        <w:ind w:start="1080" w:hanging="360"/>
-      </w:pPr>
-      <w:rPr>
-        <w:rFonts w:ascii="OpenSymbol" w:hAnsi="OpenSymbol" w:cs="OpenSymbol" w:hint="default"/>
-      </w:rPr>
+      <w:numFmt w:val="none"/>
+      <w:suff w:val="nothing"/>
+      <w:lvlText w:val=""/>
+      <w:lvlJc w:val="left"/>
+      <w:pPr>
+        <w:tabs>
+          <w:tab w:val="num" w:pos="0"/>
+        </w:tabs>
+        <w:ind w:left="0" w:hanging="0"/>
+      </w:pPr>
     </w:lvl>
     <w:lvl w:ilvl="2">
       <w:start w:val="1"/>
-      <w:numFmt w:val="bullet"/>
-      <w:lvlText w:val="▪"/>
-      <w:lvlJc w:val="start"/>
-      <w:pPr>
-        <w:tabs>
-          <w:tab w:val="num" w:pos="1440"/>
-        </w:tabs>
-        <w:ind w:start="1440" w:hanging="360"/>
-      </w:pPr>
-      <w:rPr>
-        <w:rFonts w:ascii="OpenSymbol" w:hAnsi="OpenSymbol" w:cs="OpenSymbol" w:hint="default"/>
-      </w:rPr>
+      <w:numFmt w:val="none"/>
+      <w:suff w:val="nothing"/>
+      <w:lvlText w:val=""/>
+      <w:lvlJc w:val="left"/>
+      <w:pPr>
+        <w:tabs>
+          <w:tab w:val="num" w:pos="0"/>
+        </w:tabs>
+        <w:ind w:left="0" w:hanging="0"/>
+      </w:pPr>
     </w:lvl>
     <w:lvl w:ilvl="3">
       <w:start w:val="1"/>
-      <w:numFmt w:val="bullet"/>
-      <w:lvlText w:val=""/>
-      <w:lvlJc w:val="start"/>
-      <w:pPr>
-        <w:tabs>
-          <w:tab w:val="num" w:pos="1800"/>
-        </w:tabs>
-        <w:ind w:start="1800" w:hanging="360"/>
-      </w:pPr>
-      <w:rPr>
-        <w:rFonts w:ascii="Symbol" w:hAnsi="Symbol" w:cs="Symbol" w:hint="default"/>
-      </w:rPr>
+      <w:numFmt w:val="none"/>
+      <w:suff w:val="nothing"/>
+      <w:lvlText w:val=""/>
+      <w:lvlJc w:val="left"/>
+      <w:pPr>
+        <w:tabs>
+          <w:tab w:val="num" w:pos="0"/>
+        </w:tabs>
+        <w:ind w:left="0" w:hanging="0"/>
+      </w:pPr>
     </w:lvl>
     <w:lvl w:ilvl="4">
       <w:start w:val="1"/>
-      <w:numFmt w:val="bullet"/>
-      <w:lvlText w:val="◦"/>
-      <w:lvlJc w:val="start"/>
-      <w:pPr>
-        <w:tabs>
-          <w:tab w:val="num" w:pos="2160"/>
-        </w:tabs>
-        <w:ind w:start="2160" w:hanging="360"/>
-      </w:pPr>
-      <w:rPr>
-        <w:rFonts w:ascii="OpenSymbol" w:hAnsi="OpenSymbol" w:cs="OpenSymbol" w:hint="default"/>
-      </w:rPr>
+      <w:numFmt w:val="none"/>
+      <w:suff w:val="nothing"/>
+      <w:lvlText w:val=""/>
+      <w:lvlJc w:val="left"/>
+      <w:pPr>
+        <w:tabs>
+          <w:tab w:val="num" w:pos="0"/>
+        </w:tabs>
+        <w:ind w:left="0" w:hanging="0"/>
+      </w:pPr>
     </w:lvl>
     <w:lvl w:ilvl="5">
       <w:start w:val="1"/>
-      <w:numFmt w:val="bullet"/>
-      <w:lvlText w:val="▪"/>
-      <w:lvlJc w:val="start"/>
-      <w:pPr>
-        <w:tabs>
-          <w:tab w:val="num" w:pos="2520"/>
-        </w:tabs>
-        <w:ind w:start="2520" w:hanging="360"/>
-      </w:pPr>
-      <w:rPr>
-        <w:rFonts w:ascii="OpenSymbol" w:hAnsi="OpenSymbol" w:cs="OpenSymbol" w:hint="default"/>
-      </w:rPr>
+      <w:numFmt w:val="none"/>
+      <w:suff w:val="nothing"/>
+      <w:lvlText w:val=""/>
+      <w:lvlJc w:val="left"/>
+      <w:pPr>
+        <w:tabs>
+          <w:tab w:val="num" w:pos="0"/>
+        </w:tabs>
+        <w:ind w:left="0" w:hanging="0"/>
+      </w:pPr>
     </w:lvl>
     <w:lvl w:ilvl="6">
       <w:start w:val="1"/>
-      <w:numFmt w:val="bullet"/>
-      <w:lvlText w:val=""/>
-      <w:lvlJc w:val="start"/>
-      <w:pPr>
-        <w:tabs>
-          <w:tab w:val="num" w:pos="2880"/>
-        </w:tabs>
-        <w:ind w:start="2880" w:hanging="360"/>
-      </w:pPr>
-      <w:rPr>
-        <w:rFonts w:ascii="Symbol" w:hAnsi="Symbol" w:cs="Symbol" w:hint="default"/>
-      </w:rPr>
+      <w:numFmt w:val="none"/>
+      <w:suff w:val="nothing"/>
+      <w:lvlText w:val=""/>
+      <w:lvlJc w:val="left"/>
+      <w:pPr>
+        <w:tabs>
+          <w:tab w:val="num" w:pos="0"/>
+        </w:tabs>
+        <w:ind w:left="0" w:hanging="0"/>
+      </w:pPr>
     </w:lvl>
     <w:lvl w:ilvl="7">
       <w:start w:val="1"/>
-      <w:numFmt w:val="bullet"/>
-      <w:lvlText w:val="◦"/>
-      <w:lvlJc w:val="start"/>
-      <w:pPr>
-        <w:tabs>
-          <w:tab w:val="num" w:pos="3240"/>
-        </w:tabs>
-        <w:ind w:start="3240" w:hanging="360"/>
-      </w:pPr>
-      <w:rPr>
-        <w:rFonts w:ascii="OpenSymbol" w:hAnsi="OpenSymbol" w:cs="OpenSymbol" w:hint="default"/>
-      </w:rPr>
+      <w:numFmt w:val="none"/>
+      <w:suff w:val="nothing"/>
+      <w:lvlText w:val=""/>
+      <w:lvlJc w:val="left"/>
+      <w:pPr>
+        <w:tabs>
+          <w:tab w:val="num" w:pos="0"/>
+        </w:tabs>
+        <w:ind w:left="0" w:hanging="0"/>
+      </w:pPr>
     </w:lvl>
     <w:lvl w:ilvl="8">
       <w:start w:val="1"/>
-      <w:numFmt w:val="bullet"/>
-      <w:lvlText w:val="▪"/>
-      <w:lvlJc w:val="start"/>
-      <w:pPr>
-        <w:tabs>
-          <w:tab w:val="num" w:pos="3600"/>
-        </w:tabs>
-        <w:ind w:start="3600" w:hanging="360"/>
-      </w:pPr>
-      <w:rPr>
-        <w:rFonts w:ascii="OpenSymbol" w:hAnsi="OpenSymbol" w:cs="OpenSymbol" w:hint="default"/>
-      </w:rPr>
+      <w:numFmt w:val="none"/>
+      <w:suff w:val="nothing"/>
+      <w:lvlText w:val=""/>
+      <w:lvlJc w:val="left"/>
+      <w:pPr>
+        <w:tabs>
+          <w:tab w:val="num" w:pos="0"/>
+        </w:tabs>
+        <w:ind w:left="0" w:hanging="0"/>
+      </w:pPr>
     </w:lvl>
   </w:abstractNum>
   <w:num w:numId="1">
@@ -2387,7 +2289,6 @@
     </w:rPrDefault>
     <w:pPrDefault>
       <w:pPr>
-        <w:widowControl/>
         <w:suppressAutoHyphens w:val="true"/>
       </w:pPr>
     </w:pPrDefault>
@@ -2397,7 +2298,10 @@
     <w:qFormat/>
     <w:pPr>
       <w:widowControl/>
+      <w:suppressAutoHyphens w:val="true"/>
       <w:bidi w:val="0"/>
+      <w:spacing w:before="0" w:after="0"/>
+      <w:jc w:val="left"/>
     </w:pPr>
     <w:rPr>
       <w:rFonts w:ascii="Liberation Serif" w:hAnsi="Liberation Serif" w:eastAsia="Noto Serif CJK SC" w:cs="FreeSans"/>
@@ -2453,8 +2357,8 @@
     <w:qFormat/>
     <w:rPr/>
   </w:style>
-  <w:style w:type="character" w:styleId="Bullets">
-    <w:name w:val="Bullets"/>
+  <w:style w:type="character" w:styleId="Bulletsuser">
+    <w:name w:val="Bullets (user)"/>
     <w:qFormat/>
     <w:rPr>
       <w:rFonts w:ascii="OpenSymbol" w:hAnsi="OpenSymbol" w:eastAsia="OpenSymbol" w:cs="OpenSymbol"/>
@@ -2542,7 +2446,7 @@
         <w:tab w:val="clear" w:pos="709"/>
         <w:tab w:val="right" w:pos="9638" w:leader="dot"/>
       </w:tabs>
-      <w:ind w:hanging="0" w:start="0"/>
+      <w:ind w:hanging="0" w:left="0"/>
     </w:pPr>
     <w:rPr/>
   </w:style>
@@ -2551,7 +2455,7 @@
     <w:basedOn w:val="Heading"/>
     <w:pPr>
       <w:suppressLineNumbers/>
-      <w:ind w:hanging="0" w:start="0"/>
+      <w:ind w:hanging="0" w:left="0"/>
     </w:pPr>
     <w:rPr>
       <w:b/>
@@ -2560,13 +2464,13 @@
       <w:szCs w:val="32"/>
     </w:rPr>
   </w:style>
-  <w:style w:type="paragraph" w:styleId="TableIndexHeading">
-    <w:name w:val="Table Index Heading"/>
+  <w:style w:type="paragraph" w:styleId="TableIndexHeadinguser">
+    <w:name w:val="Table Index Heading (user)"/>
     <w:basedOn w:val="IndexHeading"/>
     <w:qFormat/>
     <w:pPr>
       <w:suppressLineNumbers/>
-      <w:ind w:hanging="0" w:start="0"/>
+      <w:ind w:hanging="0" w:left="0"/>
     </w:pPr>
     <w:rPr>
       <w:b/>
@@ -2595,7 +2499,7 @@
     <w:qFormat/>
     <w:pPr>
       <w:spacing w:before="0" w:after="160"/>
-      <w:ind w:start="720"/>
+      <w:ind w:left="720"/>
       <w:contextualSpacing/>
     </w:pPr>
     <w:rPr/>

</xml_diff>